<commit_message>
Attach topic-specific software UI screenshots to each DOCX with exact software navigation guides
</commit_message>
<xml_diff>
--- a/BAITE203_Lab_Assessment_Part1_Problem_Analysis_Design_and_Configuration_Clean_Final.docx
+++ b/BAITE203_Lab_Assessment_Part1_Problem_Analysis_Design_and_Configuration_Clean_Final.docx
@@ -4076,6 +4076,19 @@
     </w:p>
     <w:p>
       <w:pPr>
+        <w:spacing w:after="80" w:line="276" w:lineRule="auto"/>
+      </w:pPr>
+      <w:r>
+        <w:rPr>
+          <w:rFonts w:ascii="Calibri" w:hAnsi="Calibri"/>
+          <w:color w:val="222222"/>
+          <w:sz w:val="21"/>
+        </w:rPr>
+        <w:t>Below are direct visual captures from the simulation software demonstrating the architectural design, failure domain isolation, and VLSM addressing plan specified in Part 1:</w:t>
+      </w:r>
+    </w:p>
+    <w:p>
+      <w:pPr>
         <w:spacing w:before="120" w:after="40"/>
         <w:jc w:val="center"/>
       </w:pPr>
@@ -4116,6 +4129,116 @@
     </w:p>
     <w:p>
       <w:pPr>
+        <w:spacing w:after="160"/>
+        <w:jc w:val="center"/>
+      </w:pPr>
+      <w:r>
+        <w:rPr>
+          <w:rFonts w:ascii="Calibri" w:hAnsi="Calibri"/>
+          <w:i/>
+          <w:color w:val="475569"/>
+          <w:sz w:val="19"/>
+        </w:rPr>
+        <w:t>Figure A1: Simulation Software — Live 3D Campus Map &amp; Node Inspector. Location: Top navigation bar -&gt; 'Live 3D Campus Map'. Shows the 372-acre multi-area topology, building gateway pins, selected node inspector (Admin-ABR Area 30), real-time FIB table, and live link controls.</w:t>
+      </w:r>
+    </w:p>
+    <w:p>
+      <w:pPr>
+        <w:spacing w:before="120" w:after="40"/>
+        <w:jc w:val="center"/>
+      </w:pPr>
+      <w:r>
+        <w:drawing>
+          <wp:inline xmlns:a="http://schemas.openxmlformats.org/drawingml/2006/main" xmlns:pic="http://schemas.openxmlformats.org/drawingml/2006/picture">
+            <wp:extent cx="5120640" cy="2598661"/>
+            <wp:docPr id="6" name="Picture 6"/>
+            <wp:cNvGraphicFramePr>
+              <a:graphicFrameLocks noChangeAspect="1"/>
+            </wp:cNvGraphicFramePr>
+            <a:graphic>
+              <a:graphicData uri="http://schemas.openxmlformats.org/drawingml/2006/picture">
+                <pic:pic>
+                  <pic:nvPicPr>
+                    <pic:cNvPr id="0" name="software_view2_architecture.png"/>
+                    <pic:cNvPicPr/>
+                  </pic:nvPicPr>
+                  <pic:blipFill>
+                    <a:blip r:embed="rId14"/>
+                    <a:stretch>
+                      <a:fillRect/>
+                    </a:stretch>
+                  </pic:blipFill>
+                  <pic:spPr>
+                    <a:xfrm>
+                      <a:off x="0" y="0"/>
+                      <a:ext cx="5120640" cy="2598661"/>
+                    </a:xfrm>
+                    <a:prstGeom prst="rect"/>
+                  </pic:spPr>
+                </pic:pic>
+              </a:graphicData>
+            </a:graphic>
+          </wp:inline>
+        </w:drawing>
+      </w:r>
+    </w:p>
+    <w:p>
+      <w:pPr>
+        <w:spacing w:after="160"/>
+        <w:jc w:val="center"/>
+      </w:pPr>
+      <w:r>
+        <w:rPr>
+          <w:rFonts w:ascii="Calibri" w:hAnsi="Calibri"/>
+          <w:i/>
+          <w:color w:val="475569"/>
+          <w:sz w:val="19"/>
+        </w:rPr>
+        <w:t>Figure A2: Simulation Software — 5-Area Architecture &amp; Failure Domain Isolation. Location: Top navigation bar -&gt; 'Area Architecture'. Details the failure domain boundaries across Area 0, Area 10, Area 20, Area 30, and Area 40 alongside algorithmic Dijkstra SPF complexity benchmarks.</w:t>
+      </w:r>
+    </w:p>
+    <w:p>
+      <w:pPr>
+        <w:spacing w:before="120" w:after="40"/>
+        <w:jc w:val="center"/>
+      </w:pPr>
+      <w:r>
+        <w:drawing>
+          <wp:inline xmlns:a="http://schemas.openxmlformats.org/drawingml/2006/main" xmlns:pic="http://schemas.openxmlformats.org/drawingml/2006/picture">
+            <wp:extent cx="5120640" cy="2598661"/>
+            <wp:docPr id="7" name="Picture 7"/>
+            <wp:cNvGraphicFramePr>
+              <a:graphicFrameLocks noChangeAspect="1"/>
+            </wp:cNvGraphicFramePr>
+            <a:graphic>
+              <a:graphicData uri="http://schemas.openxmlformats.org/drawingml/2006/picture">
+                <pic:pic>
+                  <pic:nvPicPr>
+                    <pic:cNvPr id="0" name="software_view3_addressing_vlsm.png"/>
+                    <pic:cNvPicPr/>
+                  </pic:nvPicPr>
+                  <pic:blipFill>
+                    <a:blip r:embed="rId15"/>
+                    <a:stretch>
+                      <a:fillRect/>
+                    </a:stretch>
+                  </pic:blipFill>
+                  <pic:spPr>
+                    <a:xfrm>
+                      <a:off x="0" y="0"/>
+                      <a:ext cx="5120640" cy="2598661"/>
+                    </a:xfrm>
+                    <a:prstGeom prst="rect"/>
+                  </pic:spPr>
+                </pic:pic>
+              </a:graphicData>
+            </a:graphic>
+          </wp:inline>
+        </w:drawing>
+      </w:r>
+    </w:p>
+    <w:p>
+      <w:pPr>
         <w:spacing w:after="200"/>
         <w:jc w:val="center"/>
       </w:pPr>
@@ -4126,7 +4249,7 @@
           <w:color w:val="475569"/>
           <w:sz w:val="19"/>
         </w:rPr>
-        <w:t>Figure A1: VIT Vellore Campus Network Simulation Software (Live 3D Campus Map View) — Interactive 372-Acre Topology Visualizer, Clickable Building Hotspot Pins, Selected Node Inspector (Gandhi Block Admin-ABR / Area 30), Dynamic Routing Table (FIB), and Live Network Controls.</w:t>
+        <w:t>Figure A3: Simulation Software — Campus VLSM Addressing &amp; Route Aggregation Table. Location: Top navigation bar -&gt; 'Addressing &amp; VLSM'. Tabulates the university-wide Class A 10.0.0.0/8 subnet hierarchy, CIDR masks, host capacities, and ABR summary aggregation prefixes.</w:t>
       </w:r>
     </w:p>
     <w:p>
@@ -4192,30 +4315,7 @@
           <w:color w:val="0F172A"/>
           <w:sz w:val="21"/>
         </w:rPr>
-        <w:t xml:space="preserve">2. Live Network Controls &amp; Flow Dispatcher: </w:t>
-      </w:r>
-      <w:r>
-        <w:rPr>
-          <w:rFonts w:ascii="Calibri" w:hAnsi="Calibri"/>
-          <w:color w:val="222222"/>
-          <w:sz w:val="21"/>
-        </w:rPr>
-        <w:t>Located in the left sidebar of the campus map view. Provides dynamic toggle switches to simulate optical trunk breaks (CTS to SJT, CTS to Tech Tower, CTS to Hostels, and Inter-Tower Backup). Also integrates a real-time 4.8 Gbps traffic flow oscilloscope and an end-to-end Test Packet Dispatcher with path trace animations, latency readouts, and hop metric calculations.</w:t>
-      </w:r>
-    </w:p>
-    <w:p>
-      <w:pPr>
-        <w:pStyle w:val="ListBullet"/>
-        <w:spacing w:after="60" w:line="276" w:lineRule="auto"/>
-      </w:pPr>
-      <w:r>
-        <w:rPr>
-          <w:rFonts w:ascii="Calibri" w:hAnsi="Calibri"/>
-          <w:b/>
-          <w:color w:val="0F172A"/>
-          <w:sz w:val="21"/>
-        </w:rPr>
-        <w:t xml:space="preserve">3. Area Architecture &amp; Failure Domain Isolation: </w:t>
+        <w:t xml:space="preserve">2. Area Architecture &amp; Failure Domain Isolation: </w:t>
       </w:r>
       <w:r>
         <w:rPr>
@@ -4238,7 +4338,7 @@
           <w:color w:val="0F172A"/>
           <w:sz w:val="21"/>
         </w:rPr>
-        <w:t xml:space="preserve">4. Campus VLSM Addressing &amp; Route Aggregation Table: </w:t>
+        <w:t xml:space="preserve">3. Campus VLSM Addressing &amp; Route Aggregation Table: </w:t>
       </w:r>
       <w:r>
         <w:rPr>
@@ -4247,6 +4347,29 @@
           <w:sz w:val="21"/>
         </w:rPr>
         <w:t>Located under the 'Addressing &amp; VLSM' tab. Presents the university-wide Class A Private 10.0.0.0/8 VLSM addressing plan, displaying exact subnet masks, usable host capacities, and ABR summary aggregation prefixes.</w:t>
+      </w:r>
+    </w:p>
+    <w:p>
+      <w:pPr>
+        <w:pStyle w:val="ListBullet"/>
+        <w:spacing w:after="60" w:line="276" w:lineRule="auto"/>
+      </w:pPr>
+      <w:r>
+        <w:rPr>
+          <w:rFonts w:ascii="Calibri" w:hAnsi="Calibri"/>
+          <w:b/>
+          <w:color w:val="0F172A"/>
+          <w:sz w:val="21"/>
+        </w:rPr>
+        <w:t xml:space="preserve">4. Live Network Controls &amp; Flow Dispatcher: </w:t>
+      </w:r>
+      <w:r>
+        <w:rPr>
+          <w:rFonts w:ascii="Calibri" w:hAnsi="Calibri"/>
+          <w:color w:val="222222"/>
+          <w:sz w:val="21"/>
+        </w:rPr>
+        <w:t>Located in the left sidebar of the campus map view. Provides dynamic toggle switches to simulate optical trunk breaks (CTS to SJT, CTS to Tech Tower, CTS to Hostels, and Inter-Tower Backup). Also integrates a real-time 4.8 Gbps traffic flow oscilloscope and an end-to-end Test Packet Dispatcher with path trace animations, latency readouts, and hop metric calculations.</w:t>
       </w:r>
     </w:p>
     <w:p>

</xml_diff>